<commit_message>
Fixed User Guide & FFT files
</commit_message>
<xml_diff>
--- a/How To/User Guide.docx
+++ b/How To/User Guide.docx
@@ -786,9 +786,9 @@
           <w:noProof/>
         </w:rPr>
         <w:drawing>
-          <wp:inline distT="0" distB="0" distL="0" distR="0" wp14:anchorId="6BAAF530" wp14:editId="0B3B292F">
-            <wp:extent cx="5943600" cy="1275080"/>
-            <wp:effectExtent l="0" t="0" r="0" b="1270"/>
+          <wp:inline distT="0" distB="0" distL="0" distR="0" wp14:anchorId="6BAAF530" wp14:editId="5675595A">
+            <wp:extent cx="5943600" cy="948905"/>
+            <wp:effectExtent l="0" t="0" r="0" b="3810"/>
             <wp:docPr id="229816031" name="Picture 4" descr="A screenshot of a computer"/>
             <wp:cNvGraphicFramePr>
               <a:graphicFrameLocks xmlns:a="http://schemas.openxmlformats.org/drawingml/2006/main" noChangeAspect="1"/>
@@ -800,7 +800,7 @@
                     <pic:cNvPr id="229816031" name="Picture 4" descr="A screenshot of a computer"/>
                     <pic:cNvPicPr/>
                   </pic:nvPicPr>
-                  <pic:blipFill>
+                  <pic:blipFill rotWithShape="1">
                     <a:blip r:embed="rId10">
                       <a:extLst>
                         <a:ext uri="{28A0092B-C50C-407E-A947-70E740481C1C}">
@@ -808,18 +808,25 @@
                         </a:ext>
                       </a:extLst>
                     </a:blip>
-                    <a:stretch>
-                      <a:fillRect/>
-                    </a:stretch>
+                    <a:srcRect b="25581"/>
+                    <a:stretch/>
                   </pic:blipFill>
-                  <pic:spPr>
+                  <pic:spPr bwMode="auto">
                     <a:xfrm>
                       <a:off x="0" y="0"/>
-                      <a:ext cx="5943600" cy="1275080"/>
+                      <a:ext cx="5943600" cy="948905"/>
                     </a:xfrm>
                     <a:prstGeom prst="rect">
                       <a:avLst/>
                     </a:prstGeom>
+                    <a:ln>
+                      <a:noFill/>
+                    </a:ln>
+                    <a:extLst>
+                      <a:ext uri="{53640926-AAD7-44D8-BBD7-CCE9431645EC}">
+                        <a14:shadowObscured xmlns:a14="http://schemas.microsoft.com/office/drawing/2010/main"/>
+                      </a:ext>
+                    </a:extLst>
                   </pic:spPr>
                 </pic:pic>
               </a:graphicData>
@@ -837,18 +844,38 @@
       </w:r>
       <w:proofErr w:type="gramStart"/>
       <w:r>
-        <w:t>following  location</w:t>
+        <w:t>following  location:</w:t>
+      </w:r>
+      <w:r>
+        <w:rPr>
+          <w:b/>
+          <w:bCs/>
+        </w:rPr>
+        <w:t xml:space="preserve">  C:/Users</w:t>
+      </w:r>
+      <w:r>
+        <w:rPr>
+          <w:b/>
+          <w:bCs/>
+          <w:color w:val="FF0000"/>
+        </w:rPr>
+        <w:t>/</w:t>
       </w:r>
       <w:proofErr w:type="gramEnd"/>
       <w:r>
-        <w:t>:</w:t>
-      </w:r>
-      <w:r>
-        <w:rPr>
-          <w:b/>
-          <w:bCs/>
-        </w:rPr>
-        <w:t xml:space="preserve">  C:/Users/aamalik3/Desktop/ICAP_Readback/ONRHandover/</w:t>
+        <w:rPr>
+          <w:b/>
+          <w:bCs/>
+          <w:color w:val="FF0000"/>
+        </w:rPr>
+        <w:t>&lt;USERNAME&gt;</w:t>
+      </w:r>
+      <w:r>
+        <w:rPr>
+          <w:b/>
+          <w:bCs/>
+        </w:rPr>
+        <w:t>/Desktop/</w:t>
       </w:r>
     </w:p>
     <w:p>

</xml_diff>